<commit_message>
Fix 3 issues in Chapter 3: okay, case-killing, detached
Co-Authored-By: Claude Sonnet 4.6 <noreply@anthropic.com>
</commit_message>
<xml_diff>
--- a/Chapter 3 - Keys.docx
+++ b/Chapter 3 - Keys.docx
@@ -151,10 +151,11 @@
       </w:pPr>
       <w:r>
         <w:rPr/>
-        <w:t>“Er, my name is Ernesto Klee.”</w:t>
-      </w:r>
-      <w:r>
-        <w:rPr/>
+        <w:t>“</w:t>
+      </w:r>
+      <w:r>
+        <w:rPr/>
+        <w:t>Er, my name is Ernesto Klee.”</w:t>
       </w:r>
     </w:p>
     <w:p>
@@ -250,18 +251,6 @@
         <w:rPr/>
         <w:t xml:space="preserve">Klee wasn’t expecting what he saw. It was a woman of about 35. With a lot of red hair. She’d obviously just got out of bed – possibly at the sound of her mother’s persistent denials about the gas. A lot of red hair and a lot of pale skin since she was only just about covering herself in a dressing gown. Noticing that Ernie was noticing, she tried to cover herself. It had the unhelpful effect of getting Klee to focus, definitely more than he should, on whether she was managing to cover up her cleavage. </w:t>
       </w:r>
-      <w:r>
-        <w:rPr/>
-      </w:r>
-      <w:r>
-        <w:rPr/>
-      </w:r>
-      <w:r>
-        <w:rPr/>
-      </w:r>
-      <w:r>
-        <w:rPr/>
-      </w:r>
     </w:p>
     <w:p>
       <w:pPr>
@@ -659,7 +648,163 @@
       </w:pPr>
       <w:r>
         <w:rPr/>
-        <w:t>He turned round to give it a good look. And told himself that this might be one of those times that he’d heard Americans call a “teachable moment.” Wasn’t that what he was always telling his sergeants? Getting stuck in one way of seeing things. That was how you got stuck. That was the main problem with being racist, or homophobic. Or even an inverse snob. It stopped you seeing a different angle, the bigger picture. And right now, on the drive across country to Kings Norton, on the south side of Birmingham, he’d imagined a terraced house. Yes, Pausing had said it was a house an old guy had used as a warehouse. But he hadn’t imagined it would actually be bigger than a lot of warehouses. He was completely lost thinking about this for a few seconds, before he realised that he still hadn’t quite finished the conversation with the redhead, he felt he could now call Lilly. He turned back quickly wondering if they might have shut the door while he’d been staring and revering – that can’t be the right word.</w:t>
+        <w:t xml:space="preserve">He turned round to give it a good look. And told himself that this might be one of those times that he’d heard Americans call a “teachable moment.” Wasn’t that what he was always telling his sergeants? Getting </w:t>
+      </w:r>
+      <w:r>
+        <w:rPr/>
+        <w:t>blinded by just</w:t>
+      </w:r>
+      <w:r>
+        <w:rPr/>
+        <w:t xml:space="preserve"> one way of seeing things. That was how you got stuck. That was the main problem with being racist, or homophobic. </w:t>
+      </w:r>
+      <w:r>
+        <w:rPr/>
+        <w:t>Okay, of course it wasn’t the main problem</w:t>
+      </w:r>
+      <w:r>
+        <w:rPr/>
+        <w:t>.</w:t>
+      </w:r>
+    </w:p>
+    <w:p>
+      <w:pPr>
+        <w:pStyle w:val="Normal"/>
+        <w:bidi w:val="0"/>
+        <w:jc w:val="start"/>
+        <w:rPr/>
+      </w:pPr>
+      <w:r>
+        <w:rPr/>
+      </w:r>
+    </w:p>
+    <w:p>
+      <w:pPr>
+        <w:pStyle w:val="Normal"/>
+        <w:bidi w:val="0"/>
+        <w:jc w:val="start"/>
+        <w:rPr/>
+      </w:pPr>
+      <w:r>
+        <w:rPr/>
+        <w:t>But it was the self-defeating, case-killing problem for a detective.</w:t>
+      </w:r>
+    </w:p>
+    <w:p>
+      <w:pPr>
+        <w:pStyle w:val="Normal"/>
+        <w:bidi w:val="0"/>
+        <w:jc w:val="start"/>
+        <w:rPr/>
+      </w:pPr>
+      <w:r>
+        <w:rPr/>
+      </w:r>
+    </w:p>
+    <w:p>
+      <w:pPr>
+        <w:pStyle w:val="Normal"/>
+        <w:bidi w:val="0"/>
+        <w:jc w:val="start"/>
+        <w:rPr/>
+      </w:pPr>
+      <w:r>
+        <w:rPr/>
+        <w:t>E</w:t>
+      </w:r>
+      <w:r>
+        <w:rPr/>
+        <w:t xml:space="preserve">ven </w:t>
+      </w:r>
+      <w:r>
+        <w:rPr/>
+        <w:t xml:space="preserve">being </w:t>
+      </w:r>
+      <w:r>
+        <w:rPr/>
+        <w:t xml:space="preserve">a </w:t>
+      </w:r>
+      <w:r>
+        <w:rPr/>
+        <w:t>snob. Or an</w:t>
+      </w:r>
+      <w:r>
+        <w:rPr/>
+        <w:t xml:space="preserve"> inverse snob. It stopped you seeing a different angle, the bigger picture. </w:t>
+      </w:r>
+      <w:r>
+        <w:rPr/>
+        <w:t>The big picture like a giant Unitarian Chapel.</w:t>
+      </w:r>
+    </w:p>
+    <w:p>
+      <w:pPr>
+        <w:pStyle w:val="Normal"/>
+        <w:bidi w:val="0"/>
+        <w:jc w:val="start"/>
+        <w:rPr/>
+      </w:pPr>
+      <w:r>
+        <w:rPr/>
+      </w:r>
+    </w:p>
+    <w:p>
+      <w:pPr>
+        <w:pStyle w:val="Normal"/>
+        <w:bidi w:val="0"/>
+        <w:jc w:val="start"/>
+        <w:rPr/>
+      </w:pPr>
+      <w:r>
+        <w:rPr/>
+        <w:t>O</w:t>
+      </w:r>
+      <w:r>
+        <w:rPr/>
+        <w:t xml:space="preserve">n the drive across country to Kings Norton, on the south side of Birmingham, he’d </w:t>
+      </w:r>
+      <w:r>
+        <w:rPr/>
+        <w:t>been</w:t>
+      </w:r>
+      <w:r>
+        <w:rPr/>
+        <w:t xml:space="preserve"> imagin</w:t>
+      </w:r>
+      <w:r>
+        <w:rPr/>
+        <w:t>ing</w:t>
+      </w:r>
+      <w:r>
+        <w:rPr/>
+        <w:t xml:space="preserve"> a terraced house, </w:t>
+      </w:r>
+      <w:r>
+        <w:rPr/>
+        <w:t>or possibly something grander and detached.</w:t>
+      </w:r>
+    </w:p>
+    <w:p>
+      <w:pPr>
+        <w:pStyle w:val="Normal"/>
+        <w:bidi w:val="0"/>
+        <w:jc w:val="start"/>
+        <w:rPr/>
+      </w:pPr>
+      <w:r>
+        <w:rPr/>
+      </w:r>
+    </w:p>
+    <w:p>
+      <w:pPr>
+        <w:pStyle w:val="Normal"/>
+        <w:bidi w:val="0"/>
+        <w:jc w:val="start"/>
+        <w:rPr/>
+      </w:pPr>
+      <w:r>
+        <w:rPr/>
+        <w:t>Yes, Pausing had said it was a house an old guy had used as a warehouse. But he hadn’t imagined it would actually be bigger than a lot of warehouses. He was completely lost thinking about this for a few seconds, before he realised that he still hadn’t quite finished the conversation with the redhead, he felt he could now call Lilly. He turned back quickly wondering if they might have shut the door while he’d been staring and revering – that can’t be the right word.</w:t>
       </w:r>
     </w:p>
     <w:p>
@@ -822,7 +967,7 @@
     <w:pPr>
       <w:widowControl/>
       <w:suppressAutoHyphens w:val="true"/>
-      <w:overflowPunct w:val="false"/>
+      <w:overflowPunct w:val="true"/>
       <w:bidi w:val="0"/>
       <w:spacing w:before="0" w:after="0"/>
       <w:jc w:val="start"/>

</xml_diff>